<commit_message>
Say in the response letter why the revised manuscript is supplied clean
Editorial Manager asks a revision for both a clean file and a tracked-changes one. Because the
solver, the analysis and every number were rebuilt, a tracked-changes file would mark almost every
line and would hide the changes rather than show them. The letter now says so, points to the
section, figure or table behind each reply and to the manifest, and offers a tracked-changes version
if the editor wants one.

Co-Authored-By: Claude Opus 5 <noreply@anthropic.com>
Claude-Session: https://claude.ai/code/session_01T9qr3FZNJ9jk8MqYJ2fVxn
</commit_message>
<xml_diff>
--- a/docs/RESPONSE_TO_REVIEWERS.docx
+++ b/docs/RESPONSE_TO_REVIEWERS.docx
@@ -487,6 +487,75 @@
       </w:r>
       <w:r>
         <w:t xml:space="preserve">responsibility for them.</w:t>
+      </w:r>
+    </w:p>
+    <w:p>
+      <w:pPr>
+        <w:pStyle w:val="BodyText"/>
+      </w:pPr>
+      <w:r>
+        <w:rPr>
+          <w:b/>
+          <w:bCs/>
+        </w:rPr>
+        <w:t xml:space="preserve">A note on the revised file.</w:t>
+      </w:r>
+      <w:r>
+        <w:t xml:space="preserve"> </w:t>
+      </w:r>
+      <w:r>
+        <w:t xml:space="preserve">Because the solver, the analysis and every number were rebuilt, a</w:t>
+      </w:r>
+      <w:r>
+        <w:t xml:space="preserve"> </w:t>
+      </w:r>
+      <w:r>
+        <w:t xml:space="preserve">tracked-changes file against the submitted version would mark almost every line and would not help</w:t>
+      </w:r>
+      <w:r>
+        <w:t xml:space="preserve"> </w:t>
+      </w:r>
+      <w:r>
+        <w:t xml:space="preserve">the reviewers see what changed. A clean manuscript is therefore provided, and this letter is the</w:t>
+      </w:r>
+      <w:r>
+        <w:t xml:space="preserve"> </w:t>
+      </w:r>
+      <w:r>
+        <w:t xml:space="preserve">record of the changes: each reply names the section, figure or table where the change can be</w:t>
+      </w:r>
+      <w:r>
+        <w:t xml:space="preserve"> </w:t>
+      </w:r>
+      <w:r>
+        <w:t xml:space="preserve">checked, and</w:t>
+      </w:r>
+      <w:r>
+        <w:t xml:space="preserve"> </w:t>
+      </w:r>
+      <w:r>
+        <w:rPr>
+          <w:rStyle w:val="VerbatimChar"/>
+        </w:rPr>
+        <w:t xml:space="preserve">docs/MANIFEST.md</w:t>
+      </w:r>
+      <w:r>
+        <w:t xml:space="preserve"> </w:t>
+      </w:r>
+      <w:r>
+        <w:t xml:space="preserve">in the repository links every figure, table and quoted number to the</w:t>
+      </w:r>
+      <w:r>
+        <w:t xml:space="preserve"> </w:t>
+      </w:r>
+      <w:r>
+        <w:t xml:space="preserve">script and raw output behind it. A tracked-changes version can of course be supplied if the editor</w:t>
+      </w:r>
+      <w:r>
+        <w:t xml:space="preserve"> </w:t>
+      </w:r>
+      <w:r>
+        <w:t xml:space="preserve">would like one.</w:t>
       </w:r>
     </w:p>
     <w:p>

</xml_diff>